<commit_message>
docs: the test script says why it stops where it does
A reader coming from the paper meets a console, a board, a responder
register and a trust score, then a test script that tests none of them, and
has no way to tell whether that is a choice or an oversight. It is a choice:
those screens need a signed-in account with a role granted by hand, and
working them writes to the live database - confirming or hiding a real
resident's report is not something to do casually, or twice. The document
now states that, and states what it does cover instead: the whole surface a
member of the public can reach, which is the surface where being wrong
reaches the most people.

Co-Authored-By: Claude Opus 5 <noreply@anthropic.com>
Claude-Session: https://claude.ai/code/session_01S3bfdqBaKTovVdHtsfvL5L
</commit_message>
<xml_diff>
--- a/docs/test-script/Antas-Test-Script.docx
+++ b/docs/test-script/Antas-Test-Script.docx
@@ -197,6 +197,22 @@
           <w:szCs w:val="22"/>
           <w:i/>
         </w:rPr>
+        <w:t xml:space="preserve">Scope, so the omissions are read as choices. Antas also has a moderator console with two triage queues, a master admin's board, a responder register and a trust score for emergency signals. None of it is tested here, for two reasons: every one of those screens requires a signed-in account with a role granted by hand, and working them writes to the live database - a test that confirms or hides a real resident's report is not a test that should be run casually, or twice. What is tested here is the entire surface a member of the public can reach, which is also the surface on which being wrong reaches the most people.</w:t>
+      </w:r>
+    </w:p>
+    <w:p>
+      <w:pPr>
+        <w:spacing w:before="240" w:after="240" w:line="276" w:lineRule="auto"/>
+        <w:ind w:left="0" w:right="0" w:firstLine="0"/>
+        <w:jc w:val="left"/>
+      </w:pPr>
+      <w:r>
+        <w:rPr>
+          <w:rFonts w:ascii="Times New Roman" w:hAnsi="Times New Roman" w:cs="Times New Roman" w:eastAsia="Times New Roman"/>
+          <w:sz w:val="22"/>
+          <w:szCs w:val="22"/>
+          <w:i/>
+        </w:rPr>
         <w:t xml:space="preserve">A note on language. The interface has a full Filipino and English toggle, and the expected messages below are given in both. Check whichever language the interface is showing. The toggle sits in the header, on every screen except the map - the map has no header, so switch language from Gabay, I-report, Ako or Tulong.</w:t>
       </w:r>
     </w:p>

</xml_diff>